<commit_message>
Rendu seance-2 : remplace le suivi par la version sans la section méthode
La section « Comment le projet est géré » a été retirée du document (PR #18).
L'archive et la release portaient encore la version précédente.

Co-Authored-By: Claude Opus 5 <noreply@anthropic.com>
Claude-Session: https://claude.ai/code/session_01PFbK2UsUo4WdRAQyaqezCE
</commit_message>
<xml_diff>
--- a/livrables/archives/2026-09-12-seance-2/suivi-linear.docx
+++ b/livrables/archives/2026-09-12-seance-2/suivi-linear.docx
@@ -10,7 +10,7 @@
         <w:rPr>
           <w:lang w:val="fr-FR"/>
         </w:rPr>
-        <w:t xml:space="preserve">Gestion de projet et répartition du travail</w:t>
+        <w:t xml:space="preserve">Répartition du travail</w:t>
       </w:r>
     </w:p>
     <w:p>
@@ -64,28 +64,6 @@
         </w:p>
       </w:sdtContent>
     </w:sdt>
-    <w:bookmarkStart w:id="12" w:name="comment-le-projet-est-géré"/>
-    <w:p>
-      <w:pPr>
-        <w:pStyle w:val="Heading1"/>
-      </w:pPr>
-      <w:r>
-        <w:rPr>
-          <w:rStyle w:val="SectionNumber"/>
-          <w:lang w:val="fr-FR"/>
-        </w:rPr>
-        <w:t xml:space="preserve">1</w:t>
-      </w:r>
-      <w:r>
-        <w:tab/>
-      </w:r>
-      <w:r>
-        <w:rPr>
-          <w:lang w:val="fr-FR"/>
-        </w:rPr>
-        <w:t xml:space="preserve">Comment le projet est géré</w:t>
-      </w:r>
-    </w:p>
     <w:p>
       <w:pPr>
         <w:pStyle w:val="FirstParagraph"/>
@@ -94,7 +72,7 @@
         <w:rPr>
           <w:lang w:val="fr-FR"/>
         </w:rPr>
-        <w:t xml:space="preserve">Outil de suivi : Linear,</w:t>
+        <w:t xml:space="preserve">Suivi des tâches : Linear,</w:t>
       </w:r>
       <w:r>
         <w:rPr>
@@ -117,21 +95,6 @@
         </w:rPr>
         <w:t xml:space="preserve">.</w:t>
       </w:r>
-    </w:p>
-    <w:p>
-      <w:pPr>
-        <w:pStyle w:val="Compact"/>
-        <w:numPr>
-          <w:ilvl w:val="0"/>
-          <w:numId w:val="1001"/>
-        </w:numPr>
-      </w:pPr>
-      <w:r>
-        <w:rPr>
-          <w:lang w:val="fr-FR"/>
-        </w:rPr>
-        <w:t xml:space="preserve">Un jalon par séance avec le mentor : séance 2, séance 3, séance 4, fermeture</w:t>
-      </w:r>
       <w:r>
         <w:rPr>
           <w:lang w:val="fr-FR"/>
@@ -142,107 +105,7 @@
         <w:rPr>
           <w:lang w:val="fr-FR"/>
         </w:rPr>
-        <w:t xml:space="preserve">Moodle, soutenance. Chaque jalon porte son échéance et son attendu.</w:t>
-      </w:r>
-    </w:p>
-    <w:p>
-      <w:pPr>
-        <w:pStyle w:val="Compact"/>
-        <w:numPr>
-          <w:ilvl w:val="0"/>
-          <w:numId w:val="1001"/>
-        </w:numPr>
-      </w:pPr>
-      <w:r>
-        <w:rPr>
-          <w:lang w:val="fr-FR"/>
-        </w:rPr>
-        <w:t xml:space="preserve">Une tâche par chapitre et par livrable, assignée à un membre, avec une</w:t>
-      </w:r>
-      <w:r>
-        <w:rPr>
-          <w:lang w:val="fr-FR"/>
-        </w:rPr>
-        <w:t xml:space="preserve"> </w:t>
-      </w:r>
-      <w:r>
-        <w:rPr>
-          <w:lang w:val="fr-FR"/>
-        </w:rPr>
-        <w:t xml:space="preserve">échéance. L’estimation des chapitres est en heures apprenant : leur somme</w:t>
-      </w:r>
-      <w:r>
-        <w:rPr>
-          <w:lang w:val="fr-FR"/>
-        </w:rPr>
-        <w:t xml:space="preserve"> </w:t>
-      </w:r>
-      <w:r>
-        <w:rPr>
-          <w:lang w:val="fr-FR"/>
-        </w:rPr>
-        <w:t xml:space="preserve">égale la durée cible du cours.</w:t>
-      </w:r>
-    </w:p>
-    <w:p>
-      <w:pPr>
-        <w:pStyle w:val="Compact"/>
-        <w:numPr>
-          <w:ilvl w:val="0"/>
-          <w:numId w:val="1001"/>
-        </w:numPr>
-      </w:pPr>
-      <w:r>
-        <w:rPr>
-          <w:lang w:val="fr-FR"/>
-        </w:rPr>
-        <w:t xml:space="preserve">Les tâches issues d’un retour du mentor portent le label</w:t>
-      </w:r>
-      <w:r>
-        <w:rPr>
-          <w:lang w:val="fr-FR"/>
-        </w:rPr>
-        <w:t xml:space="preserve"> </w:t>
-      </w:r>
-      <w:r>
-        <w:rPr>
-          <w:rStyle w:val="VerbatimChar"/>
-          <w:lang w:val="fr-FR"/>
-        </w:rPr>
-        <w:t xml:space="preserve">retour-mentor</w:t>
-      </w:r>
-      <w:r>
-        <w:rPr>
-          <w:lang w:val="fr-FR"/>
-        </w:rPr>
-        <w:t xml:space="preserve">,</w:t>
-      </w:r>
-      <w:r>
-        <w:rPr>
-          <w:lang w:val="fr-FR"/>
-        </w:rPr>
-        <w:t xml:space="preserve"> </w:t>
-      </w:r>
-      <w:r>
-        <w:rPr>
-          <w:lang w:val="fr-FR"/>
-        </w:rPr>
-        <w:t xml:space="preserve">ce qui permet de vérifier qu’aucun retour n’est resté sans suite.</w:t>
-      </w:r>
-    </w:p>
-    <w:p>
-      <w:pPr>
-        <w:pStyle w:val="Compact"/>
-        <w:numPr>
-          <w:ilvl w:val="0"/>
-          <w:numId w:val="1001"/>
-        </w:numPr>
-      </w:pPr>
-      <w:r>
-        <w:rPr>
-          <w:lang w:val="fr-FR"/>
-        </w:rPr>
-        <w:t xml:space="preserve">Le travail passe par une branche et une pull request sur</w:t>
+        <w:t xml:space="preserve">Dépôt du contenu :</w:t>
       </w:r>
       <w:r>
         <w:rPr>
@@ -256,66 +119,17 @@
             <w:rStyle w:val="Hyperlink"/>
             <w:lang w:val="fr-FR"/>
           </w:rPr>
-          <w:t xml:space="preserve">le dépôt GitHub</w:t>
+          <w:t xml:space="preserve">github.com/maknaeq/fyc-cours</w:t>
         </w:r>
       </w:hyperlink>
       <w:r>
         <w:rPr>
           <w:lang w:val="fr-FR"/>
         </w:rPr>
-        <w:t xml:space="preserve">, relue par un autre</w:t>
-      </w:r>
-      <w:r>
-        <w:rPr>
-          <w:lang w:val="fr-FR"/>
-        </w:rPr>
-        <w:t xml:space="preserve"> </w:t>
-      </w:r>
-      <w:r>
-        <w:rPr>
-          <w:lang w:val="fr-FR"/>
-        </w:rPr>
-        <w:t xml:space="preserve">membre avant d’être intégrée. La tâche Linear se ferme au merge.</w:t>
+        <w:t xml:space="preserve">.</w:t>
       </w:r>
     </w:p>
-    <w:p>
-      <w:pPr>
-        <w:pStyle w:val="Compact"/>
-        <w:numPr>
-          <w:ilvl w:val="0"/>
-          <w:numId w:val="1001"/>
-        </w:numPr>
-      </w:pPr>
-      <w:r>
-        <w:rPr>
-          <w:lang w:val="fr-FR"/>
-        </w:rPr>
-        <w:t xml:space="preserve">Nomenclature complète (labels, statuts, priorités, définition de terminé) :</w:t>
-      </w:r>
-      <w:r>
-        <w:rPr>
-          <w:lang w:val="fr-FR"/>
-        </w:rPr>
-        <w:t xml:space="preserve"> </w:t>
-      </w:r>
-      <w:hyperlink r:id="rId11">
-        <w:r>
-          <w:rPr>
-            <w:rStyle w:val="Hyperlink"/>
-            <w:lang w:val="fr-FR"/>
-          </w:rPr>
-          <w:t xml:space="preserve">document Linear</w:t>
-        </w:r>
-      </w:hyperlink>
-      <w:r>
-        <w:rPr>
-          <w:lang w:val="fr-FR"/>
-        </w:rPr>
-        <w:t xml:space="preserve">.</w:t>
-      </w:r>
-    </w:p>
-    <w:bookmarkEnd w:id="12"/>
-    <w:bookmarkStart w:id="18" w:name="qui-a-fait-quoi"/>
+    <w:bookmarkStart w:id="16" w:name="qui-a-fait-quoi"/>
     <w:p>
       <w:pPr>
         <w:pStyle w:val="Heading1"/>
@@ -325,7 +139,7 @@
           <w:rStyle w:val="SectionNumber"/>
           <w:lang w:val="fr-FR"/>
         </w:rPr>
-        <w:t xml:space="preserve">2</w:t>
+        <w:t xml:space="preserve">1</w:t>
       </w:r>
       <w:r>
         <w:tab/>
@@ -348,7 +162,7 @@
         <w:t xml:space="preserve">Jalon « Séance 2 : 20 % », 21 tâches : 19 terminées, 2 en cours.</w:t>
       </w:r>
     </w:p>
-    <w:bookmarkStart w:id="13" w:name="X7d208e5299e7dbcfbe3c2e5d927375a90c098d8"/>
+    <w:bookmarkStart w:id="11" w:name="X7d208e5299e7dbcfbe3c2e5d927375a90c098d8"/>
     <w:p>
       <w:pPr>
         <w:pStyle w:val="Heading2"/>
@@ -358,7 +172,7 @@
           <w:rStyle w:val="SectionNumber"/>
           <w:lang w:val="fr-FR"/>
         </w:rPr>
-        <w:t xml:space="preserve">2.1</w:t>
+        <w:t xml:space="preserve">1.1</w:t>
       </w:r>
       <w:r>
         <w:tab/>
@@ -804,8 +618,8 @@
         <w:t xml:space="preserve">En cours : document d’avancement (FYC-21), test de positionnement du chapitre 00 (FYC-10).</w:t>
       </w:r>
     </w:p>
-    <w:bookmarkEnd w:id="13"/>
-    <w:bookmarkStart w:id="14" w:name="kaan-topkaya-travaux-pratiques-laravel"/>
+    <w:bookmarkEnd w:id="11"/>
+    <w:bookmarkStart w:id="12" w:name="kaan-topkaya-travaux-pratiques-laravel"/>
     <w:p>
       <w:pPr>
         <w:pStyle w:val="Heading2"/>
@@ -815,7 +629,7 @@
           <w:rStyle w:val="SectionNumber"/>
           <w:lang w:val="fr-FR"/>
         </w:rPr>
-        <w:t xml:space="preserve">2.2</w:t>
+        <w:t xml:space="preserve">1.2</w:t>
       </w:r>
       <w:r>
         <w:tab/>
@@ -1074,8 +888,8 @@
         </w:tc>
       </w:tr>
     </w:tbl>
-    <w:bookmarkEnd w:id="14"/>
-    <w:bookmarkStart w:id="15" w:name="Xb8e008c2295148aeb4e00081c85d32b437ed6b9"/>
+    <w:bookmarkEnd w:id="12"/>
+    <w:bookmarkStart w:id="13" w:name="Xb8e008c2295148aeb4e00081c85d32b437ed6b9"/>
     <w:p>
       <w:pPr>
         <w:pStyle w:val="Heading2"/>
@@ -1085,7 +899,7 @@
           <w:rStyle w:val="SectionNumber"/>
           <w:lang w:val="fr-FR"/>
         </w:rPr>
-        <w:t xml:space="preserve">2.3</w:t>
+        <w:t xml:space="preserve">1.3</w:t>
       </w:r>
       <w:r>
         <w:tab/>
@@ -1300,8 +1114,8 @@
         </w:tc>
       </w:tr>
     </w:tbl>
-    <w:bookmarkEnd w:id="15"/>
-    <w:bookmarkStart w:id="16" w:name="Xa7f5c801823a78d284d5138a506a82953ab466a"/>
+    <w:bookmarkEnd w:id="13"/>
+    <w:bookmarkStart w:id="14" w:name="Xa7f5c801823a78d284d5138a506a82953ab466a"/>
     <w:p>
       <w:pPr>
         <w:pStyle w:val="Heading2"/>
@@ -1311,7 +1125,7 @@
           <w:rStyle w:val="SectionNumber"/>
           <w:lang w:val="fr-FR"/>
         </w:rPr>
-        <w:t xml:space="preserve">2.4</w:t>
+        <w:t xml:space="preserve">1.4</w:t>
       </w:r>
       <w:r>
         <w:tab/>
@@ -1562,8 +1376,8 @@
         <w:t xml:space="preserve">(FYC-23).</w:t>
       </w:r>
     </w:p>
-    <w:bookmarkEnd w:id="16"/>
-    <w:bookmarkStart w:id="17" w:name="tâche-collective"/>
+    <w:bookmarkEnd w:id="14"/>
+    <w:bookmarkStart w:id="15" w:name="tâche-collective"/>
     <w:p>
       <w:pPr>
         <w:pStyle w:val="Heading2"/>
@@ -1573,7 +1387,7 @@
           <w:rStyle w:val="SectionNumber"/>
           <w:lang w:val="fr-FR"/>
         </w:rPr>
-        <w:t xml:space="preserve">2.5</w:t>
+        <w:t xml:space="preserve">1.5</w:t>
       </w:r>
       <w:r>
         <w:tab/>
@@ -1689,9 +1503,9 @@
         </w:tc>
       </w:tr>
     </w:tbl>
-    <w:bookmarkEnd w:id="17"/>
-    <w:bookmarkEnd w:id="18"/>
-    <w:bookmarkStart w:id="19" w:name="retours-du-mentor-et-suites-données"/>
+    <w:bookmarkEnd w:id="15"/>
+    <w:bookmarkEnd w:id="16"/>
+    <w:bookmarkStart w:id="17" w:name="retours-du-mentor-et-suites-données"/>
     <w:p>
       <w:pPr>
         <w:pStyle w:val="Heading1"/>
@@ -1701,7 +1515,7 @@
           <w:rStyle w:val="SectionNumber"/>
           <w:lang w:val="fr-FR"/>
         </w:rPr>
-        <w:t xml:space="preserve">3</w:t>
+        <w:t xml:space="preserve">2</w:t>
       </w:r>
       <w:r>
         <w:tab/>
@@ -2224,8 +2038,8 @@
         </w:tc>
       </w:tr>
     </w:tbl>
-    <w:bookmarkEnd w:id="19"/>
-    <w:bookmarkStart w:id="20" w:name="suite-du-projet"/>
+    <w:bookmarkEnd w:id="17"/>
+    <w:bookmarkStart w:id="18" w:name="suite-du-projet"/>
     <w:p>
       <w:pPr>
         <w:pStyle w:val="Heading1"/>
@@ -2235,7 +2049,7 @@
           <w:rStyle w:val="SectionNumber"/>
           <w:lang w:val="fr-FR"/>
         </w:rPr>
-        <w:t xml:space="preserve">4</w:t>
+        <w:t xml:space="preserve">3</w:t>
       </w:r>
       <w:r>
         <w:tab/>
@@ -2554,7 +2368,7 @@
         </w:tc>
       </w:tr>
     </w:tbl>
-    <w:bookmarkEnd w:id="20"/>
+    <w:bookmarkEnd w:id="18"/>
     <w:sectPr>
       <w:footnotePr>
         <w:numRestart w:val="eachSect"/>
@@ -2665,114 +2479,8 @@
       </w:pPr>
     </w:lvl>
   </w:abstractNum>
-  <w:abstractNum w:abstractNumId="991">
-    <w:nsid w:val="0000A991"/>
-    <w:multiLevelType w:val="multilevel"/>
-    <w:lvl w:ilvl="0">
-      <w:numFmt w:val="bullet"/>
-      <w:lvlText w:val=""/>
-      <w:lvlJc w:val="left"/>
-      <w:pPr>
-        <w:ind w:left="720" w:hanging="360"/>
-      </w:pPr>
-      <w:rPr>
-        <w:rFonts w:ascii="Symbol" w:hAnsi="Symbol" w:cs="Symbol" w:hint="default"/>
-      </w:rPr>
-    </w:lvl>
-    <w:lvl w:ilvl="1">
-      <w:numFmt w:val="bullet"/>
-      <w:lvlText w:val="o"/>
-      <w:lvlJc w:val="left"/>
-      <w:pPr>
-        <w:ind w:left="1440" w:hanging="360"/>
-      </w:pPr>
-      <w:rPr>
-        <w:rFonts w:ascii="Courier New" w:hAnsi="Courier New" w:cs="Courier New" w:hint="default"/>
-      </w:rPr>
-    </w:lvl>
-    <w:lvl w:ilvl="2">
-      <w:numFmt w:val="bullet"/>
-      <w:lvlText w:val=""/>
-      <w:lvlJc w:val="left"/>
-      <w:pPr>
-        <w:ind w:left="2160" w:hanging="360"/>
-      </w:pPr>
-      <w:rPr>
-        <w:rFonts w:ascii="Wingdings" w:hAnsi="Wingdings" w:cs="Wingdings" w:hint="default"/>
-      </w:rPr>
-    </w:lvl>
-    <w:lvl w:ilvl="3">
-      <w:numFmt w:val="bullet"/>
-      <w:lvlText w:val=""/>
-      <w:lvlJc w:val="left"/>
-      <w:pPr>
-        <w:ind w:left="2880" w:hanging="360"/>
-      </w:pPr>
-      <w:rPr>
-        <w:rFonts w:ascii="Symbol" w:hAnsi="Symbol" w:cs="Symbol" w:hint="default"/>
-      </w:rPr>
-    </w:lvl>
-    <w:lvl w:ilvl="4">
-      <w:numFmt w:val="bullet"/>
-      <w:lvlText w:val="o"/>
-      <w:lvlJc w:val="left"/>
-      <w:pPr>
-        <w:ind w:left="3600" w:hanging="360"/>
-      </w:pPr>
-      <w:rPr>
-        <w:rFonts w:ascii="Courier New" w:hAnsi="Courier New" w:cs="Courier New" w:hint="default"/>
-      </w:rPr>
-    </w:lvl>
-    <w:lvl w:ilvl="5">
-      <w:numFmt w:val="bullet"/>
-      <w:lvlText w:val=""/>
-      <w:lvlJc w:val="left"/>
-      <w:pPr>
-        <w:ind w:left="4320" w:hanging="360"/>
-      </w:pPr>
-      <w:rPr>
-        <w:rFonts w:ascii="Wingdings" w:hAnsi="Wingdings" w:cs="Wingdings" w:hint="default"/>
-      </w:rPr>
-    </w:lvl>
-    <w:lvl w:ilvl="6">
-      <w:numFmt w:val="bullet"/>
-      <w:lvlText w:val=""/>
-      <w:lvlJc w:val="left"/>
-      <w:pPr>
-        <w:ind w:left="5040" w:hanging="360"/>
-      </w:pPr>
-      <w:rPr>
-        <w:rFonts w:ascii="Symbol" w:hAnsi="Symbol" w:cs="Symbol" w:hint="default"/>
-      </w:rPr>
-    </w:lvl>
-    <w:lvl w:ilvl="7">
-      <w:numFmt w:val="bullet"/>
-      <w:lvlText w:val="o"/>
-      <w:lvlJc w:val="left"/>
-      <w:pPr>
-        <w:ind w:left="5760" w:hanging="360"/>
-      </w:pPr>
-      <w:rPr>
-        <w:rFonts w:ascii="Courier New" w:hAnsi="Courier New" w:cs="Courier New" w:hint="default"/>
-      </w:rPr>
-    </w:lvl>
-    <w:lvl w:ilvl="8">
-      <w:numFmt w:val="bullet"/>
-      <w:lvlText w:val=""/>
-      <w:lvlJc w:val="left"/>
-      <w:pPr>
-        <w:ind w:left="6480" w:hanging="360"/>
-      </w:pPr>
-      <w:rPr>
-        <w:rFonts w:ascii="Wingdings" w:hAnsi="Wingdings" w:cs="Wingdings" w:hint="default"/>
-      </w:rPr>
-    </w:lvl>
-  </w:abstractNum>
   <w:num w:numId="1000">
     <w:abstractNumId w:val="990"/>
-  </w:num>
-  <w:num w:numId="1001">
-    <w:abstractNumId w:val="991"/>
   </w:num>
 </w:numbering>
 </file>

</xml_diff>